<commit_message>
Update repository and properly track 4K video via LFS
</commit_message>
<xml_diff>
--- a/milisdorfer_maturitni_prace_elektronicky_letak_program.docx
+++ b/milisdorfer_maturitni_prace_elektronicky_letak_program.docx
@@ -198,7 +198,7 @@
     </w:p>
     <w:p>
       <w:pPr>
-        <w:spacing w:before="9000" w:line="280" w:lineRule="auto"/>
+        <w:spacing w:before="9000"/>
         <w:rPr>
           <w:rFonts w:eastAsia="Times New Roman" w:cs="Times New Roman"/>
           <w:szCs w:val="24"/>
@@ -242,7 +242,6 @@
     </w:p>
     <w:p>
       <w:pPr>
-        <w:spacing w:line="280" w:lineRule="auto"/>
         <w:rPr>
           <w:rFonts w:eastAsia="Times New Roman" w:cs="Times New Roman"/>
           <w:szCs w:val="24"/>
@@ -272,7 +271,6 @@
     </w:p>
     <w:p>
       <w:pPr>
-        <w:spacing w:line="280" w:lineRule="auto"/>
         <w:rPr>
           <w:rFonts w:eastAsia="Times New Roman" w:cs="Times New Roman"/>
           <w:szCs w:val="24"/>
@@ -288,7 +286,6 @@
     </w:p>
     <w:p>
       <w:pPr>
-        <w:spacing w:line="280" w:lineRule="auto"/>
         <w:rPr>
           <w:rFonts w:eastAsia="Times New Roman" w:cs="Times New Roman"/>
           <w:szCs w:val="24"/>
@@ -311,7 +308,6 @@
     </w:p>
     <w:p>
       <w:pPr>
-        <w:spacing w:line="280" w:lineRule="auto"/>
         <w:rPr>
           <w:rFonts w:eastAsia="Times New Roman" w:cs="Times New Roman"/>
           <w:szCs w:val="24"/>
@@ -334,7 +330,6 @@
     </w:p>
     <w:p>
       <w:pPr>
-        <w:spacing w:line="280" w:lineRule="auto"/>
         <w:rPr>
           <w:rFonts w:eastAsia="Times New Roman" w:cs="Times New Roman"/>
           <w:szCs w:val="24"/>
@@ -357,7 +352,6 @@
     </w:p>
     <w:p>
       <w:pPr>
-        <w:spacing w:line="280" w:lineRule="auto"/>
         <w:rPr>
           <w:rFonts w:eastAsia="Times New Roman" w:cs="Times New Roman"/>
           <w:szCs w:val="24"/>
@@ -386,12 +380,12 @@
         </w:rPr>
       </w:pPr>
       <w:r>
+        <w:lastRenderedPageBreak/>
         <w:br w:type="page"/>
       </w:r>
     </w:p>
     <w:p>
       <w:pPr>
-        <w:spacing w:line="280" w:lineRule="auto"/>
         <w:rPr>
           <w:rFonts w:eastAsia="Times New Roman" w:cs="Times New Roman"/>
           <w:szCs w:val="24"/>
@@ -400,7 +394,7 @@
     </w:p>
     <w:p>
       <w:pPr>
-        <w:spacing w:before="8040" w:line="280" w:lineRule="auto"/>
+        <w:spacing w:before="8040"/>
         <w:rPr>
           <w:rFonts w:eastAsia="Times New Roman" w:cs="Times New Roman"/>
           <w:szCs w:val="24"/>
@@ -526,7 +520,7 @@
     </w:p>
     <w:p>
       <w:pPr>
-        <w:spacing w:after="160" w:line="259" w:lineRule="auto"/>
+        <w:spacing w:after="160"/>
         <w:jc w:val="left"/>
         <w:rPr>
           <w:rFonts w:eastAsia="Times New Roman" w:cs="Times New Roman"/>
@@ -678,6 +672,7 @@
         <w:p>
           <w:pPr>
             <w:pStyle w:val="Nadpisobsahu"/>
+            <w:spacing w:line="360" w:lineRule="auto"/>
           </w:pPr>
           <w:r>
             <w:t>Obsah</w:t>
@@ -4061,7 +4056,13 @@
         <w:ind w:firstLine="578"/>
       </w:pPr>
       <w:r>
-        <w:t>V dnešní digitální době se velká část informačních, propagačních a marketingových materiálů přesunula na internet. Tradiční formáty pro distribuci dokumentů, jako je například statické PDF, sice stále spolehlivě plní svůj základní účel, ale z hlediska moderního uživatelského zážitku (UX) začínají zaostávat. Často postrádají interaktivitu, nepůsobí dostatečně atraktivně</w:t>
+        <w:t xml:space="preserve">V dnešní digitální době se velká část informačních, propagačních a marketingových materiálů přesunula na internet. </w:t>
+      </w:r>
+      <w:r>
+        <w:t>Formát PDF se stále často používá pro sdílení dokumentů, ale oproti moderním webovým řešením nabízí méně možností interaktivity a horší uživatelský zážitek.</w:t>
+      </w:r>
+      <w:r>
+        <w:t xml:space="preserve"> Často postrádají interaktivitu, nepůsobí dostatečně atraktivně</w:t>
       </w:r>
       <w:r>
         <w:t xml:space="preserve"> a může být nekomfortní pro spousta uživatelů</w:t>
@@ -4081,7 +4082,13 @@
         <w:t xml:space="preserve"> </w:t>
       </w:r>
       <w:r>
-        <w:t xml:space="preserve">bylo transformovat obyčejné statické 2D obrázky do podoby imerzivního digitálního objektu, který věrně simuluje prohlížení fyzického letáčku. </w:t>
+        <w:t xml:space="preserve">bylo </w:t>
+      </w:r>
+      <w:r>
+        <w:t>převést běžné statické obrázky do interaktivní online podoby, která připomíná listování skutečným letákem</w:t>
+      </w:r>
+      <w:r>
+        <w:t>.</w:t>
       </w:r>
     </w:p>
     <w:p>
@@ -4220,7 +4227,7 @@
         <w:ind w:firstLine="720"/>
       </w:pPr>
       <w:r>
-        <w:t>Značkovací jazyk HTML5 tvoří sémantickou kostru aplikace. Po jeho načtení prohlížeč vytváří tzv. DOM (</w:t>
+        <w:t>HTML5 tvoří strukturu webové stránky a DOM (</w:t>
       </w:r>
       <w:proofErr w:type="spellStart"/>
       <w:r>
@@ -4236,7 +4243,28 @@
       </w:r>
       <w:proofErr w:type="spellEnd"/>
       <w:r>
-        <w:t xml:space="preserve"> Model) – stromovou strukturu, ve které je každý prvek (odstavec, obrázek, tlačítko) reprezentován jako uzel. Pro manipulaci s těmito uzly je v aplikaci využíváno programové rozhraní, které umožňuje dynamické generování prvků (např. stránek letáku) za běhu programu. Dále jsou využita specifická rozhraní HTML5, konkrétně element &lt;</w:t>
+        <w:t xml:space="preserve"> Model) představuje standardizované rozhraní, prostřednictvím kterého může JavaScript přistupovat k objektům dokumentu, reagovat na události a měnit jednotlivé prvky stránky [</w:t>
+      </w:r>
+      <w:r>
+        <w:fldChar w:fldCharType="begin"/>
+      </w:r>
+      <w:r>
+        <w:instrText>HYPERLINK  \l "_Použité_zdroje"</w:instrText>
+      </w:r>
+      <w:r>
+        <w:fldChar w:fldCharType="separate"/>
+      </w:r>
+      <w:r>
+        <w:rPr>
+          <w:rStyle w:val="Hypertextovodkaz"/>
+        </w:rPr>
+        <w:t>1</w:t>
+      </w:r>
+      <w:r>
+        <w:fldChar w:fldCharType="end"/>
+      </w:r>
+      <w:r>
+        <w:t>]. Pro manipulaci s těmito prvky je v aplikaci využíváno programové rozhraní, které umožňuje dynamické generování obsahu (např. stránek letáku) za běhu programu. Dále jsou využita specifická rozhraní HTML5, konkrétně element &lt;</w:t>
       </w:r>
       <w:proofErr w:type="spellStart"/>
       <w:r>
@@ -4314,7 +4342,37 @@
       </w:r>
       <w:proofErr w:type="spellEnd"/>
       <w:r>
-        <w:t>) a plynule je měnit pomocí skriptu. Pro tvorbu iluze hloubky a ohybu papíru jsou v CSS využity pokročilé vlastnosti stínování, jako je vnitřní stín (box-</w:t>
+        <w:t>) a plynule je měnit pomocí skriptu</w:t>
+      </w:r>
+      <w:r>
+        <w:t xml:space="preserve"> </w:t>
+      </w:r>
+      <w:r>
+        <w:t>[</w:t>
+      </w:r>
+      <w:r>
+        <w:fldChar w:fldCharType="begin"/>
+      </w:r>
+      <w:r>
+        <w:instrText>HYPERLINK  \l "_Použité_zdroje"</w:instrText>
+      </w:r>
+      <w:r>
+        <w:fldChar w:fldCharType="separate"/>
+      </w:r>
+      <w:r>
+        <w:rPr>
+          <w:rStyle w:val="Hypertextovodkaz"/>
+        </w:rPr>
+        <w:t>4</w:t>
+      </w:r>
+      <w:r>
+        <w:fldChar w:fldCharType="end"/>
+      </w:r>
+      <w:r>
+        <w:t>]</w:t>
+      </w:r>
+      <w:r>
+        <w:t>. Pro tvorbu iluze hloubky a ohybu papíru jsou v CSS využity pokročilé vlastnosti stínování, jako je vnitřní stín (box-</w:t>
       </w:r>
       <w:proofErr w:type="spellStart"/>
       <w:r>
@@ -4330,7 +4388,16 @@
       </w:r>
       <w:proofErr w:type="spellEnd"/>
       <w:r>
-        <w:t>) a hardwarově akcelerované filtry (</w:t>
+        <w:t xml:space="preserve">) a </w:t>
+      </w:r>
+      <w:r>
+        <w:t>moderní CSS filtry, které prohlížeč vykresluje plynuleji</w:t>
+      </w:r>
+      <w:r>
+        <w:t xml:space="preserve"> </w:t>
+      </w:r>
+      <w:r>
+        <w:t>(</w:t>
       </w:r>
       <w:proofErr w:type="spellStart"/>
       <w:r>
@@ -4491,6 +4558,9 @@
                               <w:t>1</w:t>
                             </w:r>
                             <w:r>
+                              <w:rPr>
+                                <w:noProof/>
+                              </w:rPr>
                               <w:fldChar w:fldCharType="end"/>
                             </w:r>
                             <w:bookmarkEnd w:id="10"/>
@@ -4510,19 +4580,7 @@
                                 <w:rPr>
                                   <w:rStyle w:val="Hypertextovodkaz"/>
                                 </w:rPr>
-                                <w:t>(zdr</w:t>
-                              </w:r>
-                              <w:r>
-                                <w:rPr>
-                                  <w:rStyle w:val="Hypertextovodkaz"/>
-                                </w:rPr>
-                                <w:t>o</w:t>
-                              </w:r>
-                              <w:r>
-                                <w:rPr>
-                                  <w:rStyle w:val="Hypertextovodkaz"/>
-                                </w:rPr>
-                                <w:t>j)</w:t>
+                                <w:t>(zdroj)</w:t>
                               </w:r>
                               <w:bookmarkEnd w:id="11"/>
                             </w:hyperlink>
@@ -4579,6 +4637,9 @@
                         <w:t>1</w:t>
                       </w:r>
                       <w:r>
+                        <w:rPr>
+                          <w:noProof/>
+                        </w:rPr>
                         <w:fldChar w:fldCharType="end"/>
                       </w:r>
                       <w:bookmarkEnd w:id="12"/>
@@ -4598,19 +4659,7 @@
                           <w:rPr>
                             <w:rStyle w:val="Hypertextovodkaz"/>
                           </w:rPr>
-                          <w:t>(zdr</w:t>
-                        </w:r>
-                        <w:r>
-                          <w:rPr>
-                            <w:rStyle w:val="Hypertextovodkaz"/>
-                          </w:rPr>
-                          <w:t>o</w:t>
-                        </w:r>
-                        <w:r>
-                          <w:rPr>
-                            <w:rStyle w:val="Hypertextovodkaz"/>
-                          </w:rPr>
-                          <w:t>j)</w:t>
+                          <w:t>(zdroj)</w:t>
                         </w:r>
                         <w:bookmarkEnd w:id="13"/>
                       </w:hyperlink>
@@ -4815,7 +4864,7 @@
     </w:p>
     <w:p>
       <w:pPr>
-        <w:spacing w:after="160" w:line="259" w:lineRule="auto"/>
+        <w:spacing w:after="160"/>
         <w:jc w:val="left"/>
         <w:rPr>
           <w:rFonts w:eastAsiaTheme="majorEastAsia" w:cstheme="majorBidi"/>
@@ -5061,6 +5110,9 @@
                               <w:t>2</w:t>
                             </w:r>
                             <w:r>
+                              <w:rPr>
+                                <w:noProof/>
+                              </w:rPr>
                               <w:fldChar w:fldCharType="end"/>
                             </w:r>
                             <w:r>
@@ -5125,6 +5177,9 @@
                         <w:t>2</w:t>
                       </w:r>
                       <w:r>
+                        <w:rPr>
+                          <w:noProof/>
+                        </w:rPr>
                         <w:fldChar w:fldCharType="end"/>
                       </w:r>
                       <w:r>
@@ -5362,6 +5417,9 @@
                               <w:t>3</w:t>
                             </w:r>
                             <w:r>
+                              <w:rPr>
+                                <w:noProof/>
+                              </w:rPr>
                               <w:fldChar w:fldCharType="end"/>
                             </w:r>
                             <w:r>
@@ -5372,19 +5430,7 @@
                                 <w:rPr>
                                   <w:rStyle w:val="Hypertextovodkaz"/>
                                 </w:rPr>
-                                <w:t>(zd</w:t>
-                              </w:r>
-                              <w:r>
-                                <w:rPr>
-                                  <w:rStyle w:val="Hypertextovodkaz"/>
-                                </w:rPr>
-                                <w:t>r</w:t>
-                              </w:r>
-                              <w:r>
-                                <w:rPr>
-                                  <w:rStyle w:val="Hypertextovodkaz"/>
-                                </w:rPr>
-                                <w:t>oj)</w:t>
+                                <w:t>(zdroj)</w:t>
                               </w:r>
                               <w:bookmarkEnd w:id="23"/>
                             </w:hyperlink>
@@ -5436,6 +5482,9 @@
                         <w:t>3</w:t>
                       </w:r>
                       <w:r>
+                        <w:rPr>
+                          <w:noProof/>
+                        </w:rPr>
                         <w:fldChar w:fldCharType="end"/>
                       </w:r>
                       <w:r>
@@ -5446,19 +5495,7 @@
                           <w:rPr>
                             <w:rStyle w:val="Hypertextovodkaz"/>
                           </w:rPr>
-                          <w:t>(zd</w:t>
-                        </w:r>
-                        <w:r>
-                          <w:rPr>
-                            <w:rStyle w:val="Hypertextovodkaz"/>
-                          </w:rPr>
-                          <w:t>r</w:t>
-                        </w:r>
-                        <w:r>
-                          <w:rPr>
-                            <w:rStyle w:val="Hypertextovodkaz"/>
-                          </w:rPr>
-                          <w:t>oj)</w:t>
+                          <w:t>(zdroj)</w:t>
                         </w:r>
                         <w:bookmarkEnd w:id="24"/>
                       </w:hyperlink>
@@ -5567,10 +5604,7 @@
         <w:t>. Poté stačí jen složku s programem elektronického letáku přesunout do IIS složky:</w:t>
       </w:r>
       <w:r>
-        <w:t xml:space="preserve"> </w:t>
-      </w:r>
-      <w:r>
-        <w:t>C:\inetpub\wwwroot\LetakV3\</w:t>
+        <w:t xml:space="preserve"> C:\inetpub\wwwroot\LetakV3\</w:t>
       </w:r>
       <w:r>
         <w:t xml:space="preserve">. </w:t>
@@ -5581,7 +5615,7 @@
     </w:p>
     <w:p>
       <w:pPr>
-        <w:spacing w:after="160" w:line="259" w:lineRule="auto"/>
+        <w:spacing w:after="160"/>
         <w:jc w:val="left"/>
       </w:pPr>
       <w:r>
@@ -5759,9 +5793,9 @@
                                 <w:szCs w:val="22"/>
                               </w:rPr>
                             </w:pPr>
-                            <w:bookmarkStart w:id="27" w:name="_Ref224336102"/>
-                            <w:bookmarkStart w:id="28" w:name="_Ref224336106"/>
-                            <w:bookmarkStart w:id="29" w:name="_Toc224337737"/>
+                            <w:bookmarkStart w:id="27" w:name="_Ref224336106"/>
+                            <w:bookmarkStart w:id="28" w:name="_Toc224337737"/>
+                            <w:bookmarkStart w:id="29" w:name="_Ref224336102"/>
                             <w:r>
                               <w:t xml:space="preserve">Obrázek </w:t>
                             </w:r>
@@ -5781,9 +5815,12 @@
                               <w:t>4</w:t>
                             </w:r>
                             <w:r>
+                              <w:rPr>
+                                <w:noProof/>
+                              </w:rPr>
                               <w:fldChar w:fldCharType="end"/>
                             </w:r>
-                            <w:bookmarkEnd w:id="28"/>
+                            <w:bookmarkEnd w:id="27"/>
                             <w:r>
                               <w:t xml:space="preserve"> </w:t>
                             </w:r>
@@ -5795,23 +5832,11 @@
                                 <w:rPr>
                                   <w:rStyle w:val="Hypertextovodkaz"/>
                                 </w:rPr>
-                                <w:t>(zd</w:t>
+                                <w:t>(zdroj)</w:t>
                               </w:r>
-                              <w:r>
-                                <w:rPr>
-                                  <w:rStyle w:val="Hypertextovodkaz"/>
-                                </w:rPr>
-                                <w:t>r</w:t>
-                              </w:r>
-                              <w:r>
-                                <w:rPr>
-                                  <w:rStyle w:val="Hypertextovodkaz"/>
-                                </w:rPr>
-                                <w:t>oj)</w:t>
-                              </w:r>
-                              <w:bookmarkEnd w:id="29"/>
+                              <w:bookmarkEnd w:id="28"/>
                             </w:hyperlink>
-                            <w:bookmarkEnd w:id="27"/>
+                            <w:bookmarkEnd w:id="29"/>
                           </w:p>
                         </w:txbxContent>
                       </wps:txbx>
@@ -5840,9 +5865,9 @@
                           <w:szCs w:val="22"/>
                         </w:rPr>
                       </w:pPr>
-                      <w:bookmarkStart w:id="30" w:name="_Ref224336102"/>
-                      <w:bookmarkStart w:id="31" w:name="_Ref224336106"/>
-                      <w:bookmarkStart w:id="32" w:name="_Toc224337737"/>
+                      <w:bookmarkStart w:id="30" w:name="_Ref224336106"/>
+                      <w:bookmarkStart w:id="31" w:name="_Toc224337737"/>
+                      <w:bookmarkStart w:id="32" w:name="_Ref224336102"/>
                       <w:r>
                         <w:t xml:space="preserve">Obrázek </w:t>
                       </w:r>
@@ -5862,9 +5887,12 @@
                         <w:t>4</w:t>
                       </w:r>
                       <w:r>
+                        <w:rPr>
+                          <w:noProof/>
+                        </w:rPr>
                         <w:fldChar w:fldCharType="end"/>
                       </w:r>
-                      <w:bookmarkEnd w:id="31"/>
+                      <w:bookmarkEnd w:id="30"/>
                       <w:r>
                         <w:t xml:space="preserve"> </w:t>
                       </w:r>
@@ -5876,23 +5904,11 @@
                           <w:rPr>
                             <w:rStyle w:val="Hypertextovodkaz"/>
                           </w:rPr>
-                          <w:t>(zd</w:t>
+                          <w:t>(zdroj)</w:t>
                         </w:r>
-                        <w:r>
-                          <w:rPr>
-                            <w:rStyle w:val="Hypertextovodkaz"/>
-                          </w:rPr>
-                          <w:t>r</w:t>
-                        </w:r>
-                        <w:r>
-                          <w:rPr>
-                            <w:rStyle w:val="Hypertextovodkaz"/>
-                          </w:rPr>
-                          <w:t>oj)</w:t>
-                        </w:r>
-                        <w:bookmarkEnd w:id="32"/>
+                        <w:bookmarkEnd w:id="31"/>
                       </w:hyperlink>
-                      <w:bookmarkEnd w:id="30"/>
+                      <w:bookmarkEnd w:id="32"/>
                     </w:p>
                   </w:txbxContent>
                 </v:textbox>
@@ -5903,10 +5919,7 @@
         </mc:AlternateContent>
       </w:r>
       <w:r>
-        <w:t xml:space="preserve"> </w:t>
-      </w:r>
-      <w:r>
-        <w:t xml:space="preserve">Obrazová data (jednotlivé stránky letáku) jsou uložena v samostatné složce </w:t>
+        <w:t xml:space="preserve"> Obrazová data (jednotlivé stránky letáku) jsou uložena v samostatné složce </w:t>
       </w:r>
       <w:proofErr w:type="spellStart"/>
       <w:r>
@@ -5971,10 +5984,7 @@
         <w:t>Její výhodou je plynulé vykreslování s využitím hardwarové akcelerace a podpora ovládání jak pomocí myši, tak i na dotykových zařízeních.</w:t>
       </w:r>
       <w:r>
-        <w:t xml:space="preserve"> </w:t>
-      </w:r>
-      <w:r>
-        <w:t xml:space="preserve">Knihovna je inicializována uvnitř metody </w:t>
+        <w:t xml:space="preserve"> Knihovna je inicializována uvnitř metody </w:t>
       </w:r>
       <w:proofErr w:type="spellStart"/>
       <w:r>
@@ -6190,7 +6200,7 @@
     </w:p>
     <w:p>
       <w:pPr>
-        <w:spacing w:after="160" w:line="259" w:lineRule="auto"/>
+        <w:spacing w:after="160"/>
         <w:jc w:val="left"/>
       </w:pPr>
       <w:r>
@@ -6342,6 +6352,9 @@
                               <w:t>5</w:t>
                             </w:r>
                             <w:r>
+                              <w:rPr>
+                                <w:noProof/>
+                              </w:rPr>
                               <w:fldChar w:fldCharType="end"/>
                             </w:r>
                             <w:r>
@@ -6352,19 +6365,7 @@
                                 <w:rPr>
                                   <w:rStyle w:val="Hypertextovodkaz"/>
                                 </w:rPr>
-                                <w:t>(zd</w:t>
-                              </w:r>
-                              <w:r>
-                                <w:rPr>
-                                  <w:rStyle w:val="Hypertextovodkaz"/>
-                                </w:rPr>
-                                <w:t>r</w:t>
-                              </w:r>
-                              <w:r>
-                                <w:rPr>
-                                  <w:rStyle w:val="Hypertextovodkaz"/>
-                                </w:rPr>
-                                <w:t>oj)</w:t>
+                                <w:t>(zdroj)</w:t>
                               </w:r>
                               <w:bookmarkEnd w:id="39"/>
                             </w:hyperlink>
@@ -6416,6 +6417,9 @@
                         <w:t>5</w:t>
                       </w:r>
                       <w:r>
+                        <w:rPr>
+                          <w:noProof/>
+                        </w:rPr>
                         <w:fldChar w:fldCharType="end"/>
                       </w:r>
                       <w:r>
@@ -6426,19 +6430,7 @@
                           <w:rPr>
                             <w:rStyle w:val="Hypertextovodkaz"/>
                           </w:rPr>
-                          <w:t>(zd</w:t>
-                        </w:r>
-                        <w:r>
-                          <w:rPr>
-                            <w:rStyle w:val="Hypertextovodkaz"/>
-                          </w:rPr>
-                          <w:t>r</w:t>
-                        </w:r>
-                        <w:r>
-                          <w:rPr>
-                            <w:rStyle w:val="Hypertextovodkaz"/>
-                          </w:rPr>
-                          <w:t>oj)</w:t>
+                          <w:t>(zdroj)</w:t>
                         </w:r>
                         <w:bookmarkEnd w:id="40"/>
                       </w:hyperlink>
@@ -6663,6 +6655,9 @@
                               <w:t>6</w:t>
                             </w:r>
                             <w:r>
+                              <w:rPr>
+                                <w:noProof/>
+                              </w:rPr>
                               <w:fldChar w:fldCharType="end"/>
                             </w:r>
                             <w:r>
@@ -6731,6 +6726,9 @@
                         <w:t>6</w:t>
                       </w:r>
                       <w:r>
+                        <w:rPr>
+                          <w:noProof/>
+                        </w:rPr>
                         <w:fldChar w:fldCharType="end"/>
                       </w:r>
                       <w:r>
@@ -6894,13 +6892,7 @@
       </w:r>
       <w:proofErr w:type="spellEnd"/>
       <w:r>
-        <w:t xml:space="preserve"> věrně simuluje fyzikální vlastnosti reálné knihy, vyžaduje pro své bezchybné vykreslení sudý počet stran (každý list musí mít líc a rub). Pokud by do vstupní složky uživatel nahrál lichý počet obrázků, došlo by k chybě ve výpočtu párování stránek a následnému narušení celkového grafického rozložení (layoutu) letáku.</w:t>
-      </w:r>
-      <w:r>
-        <w:t xml:space="preserve"> </w:t>
-      </w:r>
-      <w:r>
-        <w:t>Aby se tomuto selhání předešlo, byl do jádra aplikace navržen automatizovaný mechanismus auto-korekce.</w:t>
+        <w:t xml:space="preserve"> věrně simuluje fyzikální vlastnosti reálné knihy, vyžaduje pro své bezchybné vykreslení sudý počet stran (každý list musí mít líc a rub). Pokud by do vstupní složky uživatel nahrál lichý počet obrázků, došlo by k chybě ve výpočtu párování stránek a následnému narušení celkového grafického rozložení (layoutu) letáku. Aby se tomuto selhání předešlo, byl do jádra aplikace navržen automatizovaný mechanismus auto-korekce.</w:t>
       </w:r>
     </w:p>
     <w:p>
@@ -6982,7 +6974,7 @@
         <w:ind w:firstLine="720"/>
       </w:pPr>
       <w:r>
-        <w:t xml:space="preserve">Tato metoda nespoléhá na žádný předpřipravený externí obrázek na serveru, což zvyšuje robustnost celého řešení. Místo toho je záchranná stránka generována čistě algoritmicky za běhu programu pomocí aplikačního rozhraní HTML5 </w:t>
+        <w:t xml:space="preserve">Program si chybovou stránku vytváří sám bez potřeby uloženého obrázku. Místo toho je tato stránka generována za běhu programu pomocí HTML5 </w:t>
       </w:r>
       <w:proofErr w:type="spellStart"/>
       <w:r>
@@ -6990,10 +6982,7 @@
       </w:r>
       <w:proofErr w:type="spellEnd"/>
       <w:r>
-        <w:t xml:space="preserve"> </w:t>
-      </w:r>
-      <w:r>
-        <w:t xml:space="preserve">(viz </w:t>
+        <w:t xml:space="preserve"> (viz </w:t>
       </w:r>
       <w:r>
         <w:fldChar w:fldCharType="begin"/>
@@ -7013,6 +7002,14 @@
       <w:r>
         <w:t>)</w:t>
       </w:r>
+      <w:r>
+        <w:t xml:space="preserve">, což je prvek určený pro vykreslování grafiky pomocí </w:t>
+      </w:r>
+      <w:proofErr w:type="spellStart"/>
+      <w:r>
+        <w:t>JavaScriptu</w:t>
+      </w:r>
+      <w:proofErr w:type="spellEnd"/>
       <w:r>
         <w:t>.</w:t>
       </w:r>
@@ -7216,6 +7213,9 @@
                               <w:t>7</w:t>
                             </w:r>
                             <w:r>
+                              <w:rPr>
+                                <w:noProof/>
+                              </w:rPr>
                               <w:fldChar w:fldCharType="end"/>
                             </w:r>
                             <w:r>
@@ -7288,6 +7288,9 @@
                         <w:t>7</w:t>
                       </w:r>
                       <w:r>
+                        <w:rPr>
+                          <w:noProof/>
+                        </w:rPr>
                         <w:fldChar w:fldCharType="end"/>
                       </w:r>
                       <w:r>
@@ -7446,13 +7449,7 @@
         <w:fldChar w:fldCharType="separate"/>
       </w:r>
       <w:r>
-        <w:t>CSS3</w:t>
-      </w:r>
-      <w:r>
-        <w:t xml:space="preserve"> </w:t>
-      </w:r>
-      <w:r>
-        <w:t>pro moderní design</w:t>
+        <w:t>CSS3 pro moderní design</w:t>
       </w:r>
       <w:r>
         <w:fldChar w:fldCharType="end"/>
@@ -7682,6 +7679,9 @@
                               <w:t>8</w:t>
                             </w:r>
                             <w:r>
+                              <w:rPr>
+                                <w:noProof/>
+                              </w:rPr>
                               <w:fldChar w:fldCharType="end"/>
                             </w:r>
                             <w:bookmarkEnd w:id="53"/>
@@ -7752,6 +7752,9 @@
                         <w:t>8</w:t>
                       </w:r>
                       <w:r>
+                        <w:rPr>
+                          <w:noProof/>
+                        </w:rPr>
                         <w:fldChar w:fldCharType="end"/>
                       </w:r>
                       <w:bookmarkEnd w:id="55"/>
@@ -7843,6 +7846,9 @@
       <w:r>
         <w:t>zmenšuje a zvětšuje, ale vždy si zachovává svůj tvar.</w:t>
       </w:r>
+      <w:r>
+        <w:tab/>
+      </w:r>
     </w:p>
     <w:p>
       <w:pPr>
@@ -7931,13 +7937,7 @@
       </w:r>
       <w:proofErr w:type="gramEnd"/>
       <w:r>
-        <w:t xml:space="preserve"> průhledností. Díky tomu vzniká realistický gradient, který simuluje přirozené zastínění v místě ohybu papíru</w:t>
-      </w:r>
-      <w:r>
-        <w:t xml:space="preserve"> </w:t>
-      </w:r>
-      <w:r>
-        <w:t xml:space="preserve">(viz </w:t>
+        <w:t xml:space="preserve"> průhledností. Díky tomu vzniká realistický gradient, který simuluje přirozené zastínění v místě ohybu papíru (viz </w:t>
       </w:r>
       <w:r>
         <w:fldChar w:fldCharType="begin"/>
@@ -7949,13 +7949,7 @@
         <w:fldChar w:fldCharType="separate"/>
       </w:r>
       <w:r>
-        <w:t>Obráze</w:t>
-      </w:r>
-      <w:r>
-        <w:t>k</w:t>
-      </w:r>
-      <w:r>
-        <w:t xml:space="preserve"> </w:t>
+        <w:t xml:space="preserve">Obrázek </w:t>
       </w:r>
       <w:r>
         <w:rPr>
@@ -8029,13 +8023,7 @@
       </w:pPr>
       <w:r>
         <w:lastRenderedPageBreak/>
-        <w:t>Parametry tohoto efektu nejsou v CSS definovány staticky. Místo toho využívají globální CSS proměnné, například:</w:t>
-      </w:r>
-      <w:r>
-        <w:t xml:space="preserve"> </w:t>
-      </w:r>
-      <w:r>
-        <w:t>--</w:t>
+        <w:t>Parametry tohoto efektu nejsou v CSS definovány staticky. Místo toho využívají globální CSS proměnné, například: --</w:t>
       </w:r>
       <w:proofErr w:type="spellStart"/>
       <w:r>
@@ -8043,10 +8031,7 @@
       </w:r>
       <w:proofErr w:type="spellEnd"/>
       <w:r>
-        <w:t xml:space="preserve">, </w:t>
-      </w:r>
-      <w:r>
-        <w:t>--</w:t>
+        <w:t>, --</w:t>
       </w:r>
       <w:proofErr w:type="spellStart"/>
       <w:r>
@@ -8054,13 +8039,7 @@
       </w:r>
       <w:proofErr w:type="spellEnd"/>
       <w:r>
-        <w:t>-offset</w:t>
-      </w:r>
-      <w:r>
-        <w:t xml:space="preserve">, </w:t>
-      </w:r>
-      <w:r>
-        <w:t>--</w:t>
+        <w:t>-offset, --</w:t>
       </w:r>
       <w:proofErr w:type="spellStart"/>
       <w:r>
@@ -8340,10 +8319,7 @@
         <w:ind w:firstLine="720"/>
       </w:pPr>
       <w:r>
-        <w:t>Jak bylo popsáno v teoretické části (viz</w:t>
-      </w:r>
-      <w:r>
-        <w:t xml:space="preserve"> </w:t>
+        <w:t xml:space="preserve">Jak bylo popsáno v teoretické části (viz </w:t>
       </w:r>
       <w:r>
         <w:fldChar w:fldCharType="begin"/>
@@ -8355,13 +8331,7 @@
         <w:fldChar w:fldCharType="separate"/>
       </w:r>
       <w:r>
-        <w:t>CSS3 pr</w:t>
-      </w:r>
-      <w:r>
-        <w:t>o</w:t>
-      </w:r>
-      <w:r>
-        <w:t xml:space="preserve"> moderní design</w:t>
+        <w:t>CSS3 pro moderní design</w:t>
       </w:r>
       <w:r>
         <w:fldChar w:fldCharType="end"/>
@@ -8505,6 +8475,9 @@
                               <w:t>9</w:t>
                             </w:r>
                             <w:r>
+                              <w:rPr>
+                                <w:noProof/>
+                              </w:rPr>
                               <w:fldChar w:fldCharType="end"/>
                             </w:r>
                             <w:r>
@@ -8570,6 +8543,9 @@
                         <w:t>9</w:t>
                       </w:r>
                       <w:r>
+                        <w:rPr>
+                          <w:noProof/>
+                        </w:rPr>
                         <w:fldChar w:fldCharType="end"/>
                       </w:r>
                       <w:r>
@@ -8691,10 +8667,7 @@
         <w:ind w:firstLine="720"/>
       </w:pPr>
       <w:r>
-        <w:t>V souladu se zásadami moderního UI/UX designu (viz</w:t>
-      </w:r>
-      <w:r>
-        <w:t xml:space="preserve"> </w:t>
+        <w:t xml:space="preserve">V souladu se zásadami moderního UI/UX designu (viz </w:t>
       </w:r>
       <w:r>
         <w:fldChar w:fldCharType="begin"/>
@@ -8706,13 +8679,7 @@
         <w:fldChar w:fldCharType="separate"/>
       </w:r>
       <w:r>
-        <w:t>Zásady moderní</w:t>
-      </w:r>
-      <w:r>
-        <w:t>h</w:t>
-      </w:r>
-      <w:r>
-        <w:t>o UI/UX designu</w:t>
+        <w:t>Zásady moderního UI/UX designu</w:t>
       </w:r>
       <w:r>
         <w:fldChar w:fldCharType="end"/>
@@ -8869,6 +8836,9 @@
                               <w:t>10</w:t>
                             </w:r>
                             <w:r>
+                              <w:rPr>
+                                <w:noProof/>
+                              </w:rPr>
                               <w:fldChar w:fldCharType="end"/>
                             </w:r>
                             <w:r>
@@ -8942,6 +8912,9 @@
                         <w:t>10</w:t>
                       </w:r>
                       <w:r>
+                        <w:rPr>
+                          <w:noProof/>
+                        </w:rPr>
                         <w:fldChar w:fldCharType="end"/>
                       </w:r>
                       <w:r>
@@ -9105,10 +9078,7 @@
         <w:t>3</w:t>
       </w:r>
       <w:r>
-        <w:t>, 2.mp3, 3.mp3</w:t>
-      </w:r>
-      <w:r>
-        <w:t xml:space="preserve"> viz </w:t>
+        <w:t xml:space="preserve">, 2.mp3, 3.mp3 viz </w:t>
       </w:r>
       <w:r>
         <w:fldChar w:fldCharType="begin"/>
@@ -9120,13 +9090,7 @@
         <w:fldChar w:fldCharType="separate"/>
       </w:r>
       <w:r>
-        <w:t>Obrá</w:t>
-      </w:r>
-      <w:r>
-        <w:t>z</w:t>
-      </w:r>
-      <w:r>
-        <w:t xml:space="preserve">ek </w:t>
+        <w:t xml:space="preserve">Obrázek </w:t>
       </w:r>
       <w:r>
         <w:rPr>
@@ -9257,7 +9221,13 @@
         <w:ind w:firstLine="431"/>
       </w:pPr>
       <w:r>
-        <w:t xml:space="preserve">Hlavní cíl práce, kterým bylo vytvoření interaktivní online formy propagačního letáku na základě požadavků vedení školy, byl úspěšně splněn. Původní statické obrázky byly transformovány do podoby digitálního objektu simulujícího reálné listování. Aplikace dynamicky načítá obrazová data ze serveru, automaticky filtruje a řadí vstupní soubory a pomocí knihovny </w:t>
+        <w:t xml:space="preserve">Hlavní cíl práce, kterým bylo vytvoření interaktivní online formy propagačního letáku na základě požadavků vedení školy, byl úspěšně splněn. </w:t>
+      </w:r>
+      <w:r>
+        <w:t>Původní obrázky letáku byly převedeny do interaktivní podoby, která simuluje listování jako u skutečného letáku</w:t>
+      </w:r>
+      <w:r>
+        <w:t xml:space="preserve">. Aplikace dynamicky načítá obrazová data ze serveru, automaticky filtruje a řadí vstupní soubory a pomocí knihovny </w:t>
       </w:r>
       <w:proofErr w:type="spellStart"/>
       <w:r>
@@ -9313,10 +9283,7 @@
         <w:ind w:firstLine="431"/>
       </w:pPr>
       <w:r>
-        <w:t>Lze konstatovat, že vytvořená aplikace představuje moderní a uživatelsky přívětivé řešení pro prezentaci digitálních letáků a je připravena k praktickému nasazení na web</w:t>
-      </w:r>
-      <w:r>
-        <w:t>.</w:t>
+        <w:t>Lze konstatovat, že vytvořená aplikace představuje moderní a uživatelsky přívětivé řešení pro prezentaci digitálních letáků a je připravena k praktickému nasazení na web.</w:t>
       </w:r>
     </w:p>
     <w:p>
@@ -9324,6 +9291,8 @@
         <w:pStyle w:val="Nadpis1"/>
       </w:pPr>
       <w:bookmarkStart w:id="70" w:name="_Toc224339038"/>
+      <w:bookmarkStart w:id="71" w:name="_Použité_zdroje"/>
+      <w:bookmarkEnd w:id="71"/>
       <w:r>
         <w:lastRenderedPageBreak/>
         <w:t>Použité zdroje</w:t>
@@ -9331,6 +9300,9 @@
       <w:bookmarkEnd w:id="70"/>
     </w:p>
     <w:p>
+      <w:pPr>
+        <w:jc w:val="left"/>
+      </w:pPr>
       <w:r>
         <w:t>[1]</w:t>
       </w:r>
@@ -9338,44 +9310,58 @@
         <w:t xml:space="preserve"> </w:t>
       </w:r>
       <w:r>
-        <w:t xml:space="preserve">FLIPPINGBOOK. </w:t>
-      </w:r>
-      <w:proofErr w:type="spellStart"/>
-      <w:r>
-        <w:t>What</w:t>
-      </w:r>
-      <w:proofErr w:type="spellEnd"/>
+        <w:t>SALVET, Pavel.</w:t>
+      </w:r>
       <w:r>
         <w:t xml:space="preserve"> </w:t>
       </w:r>
-      <w:proofErr w:type="spellStart"/>
-      <w:r>
-        <w:t>is</w:t>
-      </w:r>
-      <w:proofErr w:type="spellEnd"/>
-      <w:r>
-        <w:t xml:space="preserve"> a </w:t>
-      </w:r>
-      <w:proofErr w:type="spellStart"/>
-      <w:r>
-        <w:t>flipbook</w:t>
-      </w:r>
-      <w:proofErr w:type="spellEnd"/>
-      <w:r>
-        <w:t xml:space="preserve">? [online]. Dostupné z: </w:t>
+      <w:r>
+        <w:rPr>
+          <w:i/>
+          <w:iCs/>
+        </w:rPr>
+        <w:t xml:space="preserve">Rychlý průvodce pokročilým </w:t>
+      </w:r>
+      <w:proofErr w:type="spellStart"/>
+      <w:r>
+        <w:rPr>
+          <w:i/>
+          <w:iCs/>
+        </w:rPr>
+        <w:t>JavaScriptem</w:t>
+      </w:r>
+      <w:proofErr w:type="spellEnd"/>
+      <w:r>
+        <w:t>. Online. Interval.cz. 2010. Dostupné z: </w:t>
       </w:r>
       <w:hyperlink r:id="rId50" w:history="1">
         <w:r>
           <w:rPr>
             <w:rStyle w:val="Hypertextovodkaz"/>
-            <w:rFonts w:eastAsia="Times New Roman" w:cs="Times New Roman"/>
-            <w:szCs w:val="24"/>
           </w:rPr>
-          <w:t>https://flippingbook.com</w:t>
+          <w:t>https://w</w:t>
+        </w:r>
+        <w:r>
+          <w:rPr>
+            <w:rStyle w:val="Hypertextovodkaz"/>
+          </w:rPr>
+          <w:t>w</w:t>
+        </w:r>
+        <w:r>
+          <w:rPr>
+            <w:rStyle w:val="Hypertextovodkaz"/>
+          </w:rPr>
+          <w:t>w.interval.cz/clanky/rychly-pruvodce-pokrocilym-javascriptem/</w:t>
         </w:r>
       </w:hyperlink>
-    </w:p>
-    <w:p>
+      <w:r>
+        <w:t>. [cit. 2026-03-15].</w:t>
+      </w:r>
+    </w:p>
+    <w:p>
+      <w:pPr>
+        <w:jc w:val="left"/>
+      </w:pPr>
       <w:r>
         <w:t>[2]</w:t>
       </w:r>
@@ -9383,74 +9369,197 @@
         <w:t xml:space="preserve"> </w:t>
       </w:r>
       <w:r>
-        <w:t xml:space="preserve">GOOGLE. Google </w:t>
-      </w:r>
-      <w:proofErr w:type="spellStart"/>
-      <w:r>
-        <w:t>Analytics</w:t>
-      </w:r>
-      <w:proofErr w:type="spellEnd"/>
-      <w:r>
-        <w:t xml:space="preserve"> – Oficiální dokumentace [online]. Dostupné z: </w:t>
+        <w:t>HANÁK, Drahomír.</w:t>
+      </w:r>
+      <w:r>
+        <w:t xml:space="preserve"> </w:t>
+      </w:r>
+      <w:proofErr w:type="spellStart"/>
+      <w:r>
+        <w:rPr>
+          <w:i/>
+          <w:iCs/>
+        </w:rPr>
+        <w:t>Canvas</w:t>
+      </w:r>
+      <w:proofErr w:type="spellEnd"/>
+      <w:r>
+        <w:rPr>
+          <w:i/>
+          <w:iCs/>
+        </w:rPr>
+        <w:t xml:space="preserve"> aneb grafika </w:t>
+      </w:r>
+      <w:proofErr w:type="spellStart"/>
+      <w:r>
+        <w:rPr>
+          <w:i/>
+          <w:iCs/>
+        </w:rPr>
+        <w:t>JavaScriptem</w:t>
+      </w:r>
+      <w:proofErr w:type="spellEnd"/>
+      <w:r>
+        <w:t xml:space="preserve">. Online. </w:t>
+      </w:r>
+      <w:r>
+        <w:t>ITnetwork</w:t>
+      </w:r>
+      <w:r>
+        <w:t>.cz. Dostupné z: </w:t>
       </w:r>
       <w:hyperlink r:id="rId51" w:history="1">
         <w:r>
           <w:rPr>
             <w:rStyle w:val="Hypertextovodkaz"/>
-            <w:rFonts w:eastAsia="Times New Roman" w:cs="Times New Roman"/>
-            <w:szCs w:val="24"/>
           </w:rPr>
-          <w:t>https://support.google.com/analytics</w:t>
+          <w:t>https://www.itnetwork.cz/javascript/zaklady/zdrojove-kody/canvas-aneb-grafika-javascriptem</w:t>
         </w:r>
       </w:hyperlink>
-    </w:p>
-    <w:p>
+      <w:r>
+        <w:t>. [cit. 2026-03-15].</w:t>
+      </w:r>
+    </w:p>
+    <w:p>
+      <w:pPr>
+        <w:jc w:val="left"/>
+      </w:pPr>
       <w:r>
         <w:t xml:space="preserve">[3] </w:t>
       </w:r>
       <w:r>
-        <w:t>ČESKO. Zákon č. 480/2004 Sb., o některých službách informační společnosti. In: Sbírka zákonů České republiky. 2004.</w:t>
-      </w:r>
-    </w:p>
-    <w:p>
-      <w:r>
-        <w:t>[4]</w:t>
-      </w:r>
-      <w:r>
-        <w:t xml:space="preserve"> GURU, UX. Princip F-vzoru: Jak uživatelé skenují webové stránky a digitální dokumenty. [online]. 2025 [cit. 2026-02-15]. Dostupné z: </w:t>
+        <w:t>VEVERKA, Radek.</w:t>
+      </w:r>
+      <w:r>
+        <w:t xml:space="preserve"> </w:t>
+      </w:r>
+      <w:r>
+        <w:rPr>
+          <w:i/>
+          <w:iCs/>
+        </w:rPr>
+        <w:t xml:space="preserve">Asynchronní požadavky s využitím </w:t>
+      </w:r>
+      <w:proofErr w:type="spellStart"/>
+      <w:r>
+        <w:rPr>
+          <w:i/>
+          <w:iCs/>
+        </w:rPr>
+        <w:t>fetch</w:t>
+      </w:r>
+      <w:proofErr w:type="spellEnd"/>
+      <w:r>
+        <w:rPr>
+          <w:i/>
+          <w:iCs/>
+        </w:rPr>
+        <w:t xml:space="preserve"> API v </w:t>
+      </w:r>
+      <w:proofErr w:type="spellStart"/>
+      <w:r>
+        <w:rPr>
+          <w:i/>
+          <w:iCs/>
+        </w:rPr>
+        <w:t>JavaScriptu</w:t>
+      </w:r>
+      <w:proofErr w:type="spellEnd"/>
+      <w:r>
+        <w:t xml:space="preserve">. Online. </w:t>
+      </w:r>
+      <w:r>
+        <w:t>ITnetwork</w:t>
+      </w:r>
+      <w:r>
+        <w:t>.cz. Dostupné z: </w:t>
       </w:r>
       <w:hyperlink r:id="rId52" w:history="1">
         <w:r>
           <w:rPr>
             <w:rStyle w:val="Hypertextovodkaz"/>
           </w:rPr>
-          <w:t>https://www.uxdesign.cc</w:t>
+          <w:t>https://www.itnetwork.cz/javascript/oop/asynchronni-pozadavky-s-vyuzitim-fetch-api-v-javascriptu</w:t>
         </w:r>
       </w:hyperlink>
-    </w:p>
-    <w:p>
-      <w:r>
-        <w:t>[5]</w:t>
+      <w:r>
+        <w:t>. [cit. 2026-03-15].</w:t>
+      </w:r>
+    </w:p>
+    <w:p>
+      <w:pPr>
+        <w:jc w:val="left"/>
+      </w:pPr>
+      <w:r>
+        <w:t>[4]</w:t>
       </w:r>
       <w:r>
         <w:t xml:space="preserve"> </w:t>
       </w:r>
       <w:r>
-        <w:t xml:space="preserve">WIKIPEDIE. Internetový katalog. [online]. [cit. 2026-02-15]. Dostupné z: </w:t>
+        <w:t>MICHÁLEK, Martin. </w:t>
+      </w:r>
+      <w:r>
+        <w:rPr>
+          <w:i/>
+          <w:iCs/>
+        </w:rPr>
+        <w:t>CSS proměnné (nebo také autorské či volitelné vlastnosti)</w:t>
+      </w:r>
+      <w:r>
+        <w:t>. Online. Vzhurudolu.cz. Dostupné z: </w:t>
       </w:r>
       <w:hyperlink r:id="rId53" w:history="1">
         <w:r>
           <w:rPr>
             <w:rStyle w:val="Hypertextovodkaz"/>
-            <w:rFonts w:eastAsia="Times New Roman" w:cs="Times New Roman"/>
-            <w:szCs w:val="24"/>
           </w:rPr>
-          <w:t>https://cs.wikipedia.org/wiki/Internetov%C3%BD_katalog</w:t>
+          <w:t>https://www</w:t>
+        </w:r>
+        <w:r>
+          <w:rPr>
+            <w:rStyle w:val="Hypertextovodkaz"/>
+          </w:rPr>
+          <w:t>.</w:t>
+        </w:r>
+        <w:r>
+          <w:rPr>
+            <w:rStyle w:val="Hypertextovodkaz"/>
+          </w:rPr>
+          <w:t>vzhurudolu.cz/</w:t>
+        </w:r>
+        <w:proofErr w:type="spellStart"/>
+        <w:r>
+          <w:rPr>
+            <w:rStyle w:val="Hypertextovodkaz"/>
+          </w:rPr>
+          <w:t>prirucka</w:t>
+        </w:r>
+        <w:proofErr w:type="spellEnd"/>
+        <w:r>
+          <w:rPr>
+            <w:rStyle w:val="Hypertextovodkaz"/>
+          </w:rPr>
+          <w:t>/css-promenne</w:t>
         </w:r>
       </w:hyperlink>
-    </w:p>
-    <w:p>
-      <w:pPr>
+      <w:r>
+        <w:t>. [cit. 2026-03-15].</w:t>
+      </w:r>
+    </w:p>
+    <w:p>
+      <w:pPr>
+        <w:jc w:val="left"/>
+      </w:pPr>
+    </w:p>
+    <w:p>
+      <w:pPr>
+        <w:jc w:val="left"/>
+      </w:pPr>
+    </w:p>
+    <w:p>
+      <w:pPr>
+        <w:jc w:val="left"/>
         <w:rPr>
           <w:rFonts w:eastAsia="Times New Roman" w:cs="Times New Roman"/>
           <w:color w:val="EE0000"/>
@@ -9472,6 +9581,7 @@
           <w:tab w:val="left" w:pos="3402"/>
         </w:tabs>
         <w:spacing w:before="120" w:after="0"/>
+        <w:jc w:val="left"/>
         <w:rPr>
           <w:rFonts w:eastAsia="Times New Roman" w:cs="Times New Roman"/>
           <w:szCs w:val="24"/>
@@ -9482,12 +9592,12 @@
       <w:pPr>
         <w:pStyle w:val="Nadpis1"/>
       </w:pPr>
-      <w:bookmarkStart w:id="71" w:name="_Toc224339039"/>
+      <w:bookmarkStart w:id="72" w:name="_Toc224339039"/>
       <w:r>
         <w:lastRenderedPageBreak/>
         <w:t>Seznam použitých obrázků</w:t>
       </w:r>
-      <w:bookmarkEnd w:id="71"/>
+      <w:bookmarkEnd w:id="72"/>
     </w:p>
     <w:p>
       <w:pPr>
@@ -10236,12 +10346,12 @@
       <w:pPr>
         <w:pStyle w:val="Nadpis1"/>
       </w:pPr>
-      <w:bookmarkStart w:id="72" w:name="_Toc224339040"/>
+      <w:bookmarkStart w:id="73" w:name="_Toc224339040"/>
       <w:r>
         <w:lastRenderedPageBreak/>
         <w:t>Seznam použitých tabulek</w:t>
       </w:r>
-      <w:bookmarkEnd w:id="72"/>
+      <w:bookmarkEnd w:id="73"/>
     </w:p>
     <w:p>
       <w:pPr>
@@ -10265,12 +10375,12 @@
       <w:pPr>
         <w:pStyle w:val="Nadpis1"/>
       </w:pPr>
-      <w:bookmarkStart w:id="73" w:name="_Toc224339041"/>
+      <w:bookmarkStart w:id="74" w:name="_Toc224339041"/>
       <w:r>
         <w:lastRenderedPageBreak/>
         <w:t>Seznam příloh</w:t>
       </w:r>
-      <w:bookmarkEnd w:id="73"/>
+      <w:bookmarkEnd w:id="74"/>
     </w:p>
     <w:p>
       <w:pPr>
@@ -13829,6 +13939,10 @@
 </file>
 
 <file path=customXml/item1.xml><?xml version="1.0" encoding="utf-8"?>
+<b:Sources xmlns:b="http://schemas.openxmlformats.org/officeDocument/2006/bibliography" xmlns="http://schemas.openxmlformats.org/officeDocument/2006/bibliography" SelectedStyle="\APASixthEditionOfficeOnline.xsl" StyleName="APA" Version="6"/>
+</file>
+
+<file path=customXml/item2.xml><?xml version="1.0" encoding="utf-8"?>
 <p:properties xmlns:p="http://schemas.microsoft.com/office/2006/metadata/properties" xmlns:xsi="http://www.w3.org/2001/XMLSchema-instance" xmlns:pc="http://schemas.microsoft.com/office/infopath/2007/PartnerControls">
   <documentManagement>
     <lcf76f155ced4ddcb4097134ff3c332f xmlns="153c4878-02f9-4396-b02a-fe3aa7d7971f">
@@ -13837,15 +13951,6 @@
     <TaxCatchAll xmlns="25aa8985-1fc4-4e97-a914-b84ef2743878" xsi:nil="true"/>
   </documentManagement>
 </p:properties>
-</file>
-
-<file path=customXml/item2.xml><?xml version="1.0" encoding="utf-8"?>
-<?mso-contentType ?>
-<FormTemplates xmlns="http://schemas.microsoft.com/sharepoint/v3/contenttype/forms">
-  <Display>DocumentLibraryForm</Display>
-  <Edit>DocumentLibraryForm</Edit>
-  <New>DocumentLibraryForm</New>
-</FormTemplates>
 </file>
 
 <file path=customXml/item3.xml><?xml version="1.0" encoding="utf-8"?>
@@ -14044,24 +14149,29 @@
 </file>
 
 <file path=customXml/item5.xml><?xml version="1.0" encoding="utf-8"?>
-<b:Sources xmlns:b="http://schemas.openxmlformats.org/officeDocument/2006/bibliography" xmlns="http://schemas.openxmlformats.org/officeDocument/2006/bibliography" SelectedStyle="\APASixthEditionOfficeOnline.xsl" StyleName="APA" Version="6"/>
+<?mso-contentType ?>
+<FormTemplates xmlns="http://schemas.microsoft.com/sharepoint/v3/contenttype/forms">
+  <Display>DocumentLibraryForm</Display>
+  <Edit>DocumentLibraryForm</Edit>
+  <New>DocumentLibraryForm</New>
+</FormTemplates>
 </file>
 
 <file path=customXml/itemProps1.xml><?xml version="1.0" encoding="utf-8"?>
+<ds:datastoreItem xmlns:ds="http://schemas.openxmlformats.org/officeDocument/2006/customXml" ds:itemID="{664C9CA2-DAAF-46E5-825C-EB5C7B5D07C9}">
+  <ds:schemaRefs>
+    <ds:schemaRef ds:uri="http://schemas.openxmlformats.org/officeDocument/2006/bibliography"/>
+  </ds:schemaRefs>
+</ds:datastoreItem>
+</file>
+
+<file path=customXml/itemProps2.xml><?xml version="1.0" encoding="utf-8"?>
 <ds:datastoreItem xmlns:ds="http://schemas.openxmlformats.org/officeDocument/2006/customXml" ds:itemID="{A5ADED93-EDE7-4288-9C20-7D2C55659F1B}">
   <ds:schemaRefs>
     <ds:schemaRef ds:uri="http://schemas.microsoft.com/office/2006/metadata/properties"/>
     <ds:schemaRef ds:uri="http://schemas.microsoft.com/office/infopath/2007/PartnerControls"/>
     <ds:schemaRef ds:uri="153c4878-02f9-4396-b02a-fe3aa7d7971f"/>
     <ds:schemaRef ds:uri="25aa8985-1fc4-4e97-a914-b84ef2743878"/>
-  </ds:schemaRefs>
-</ds:datastoreItem>
-</file>
-
-<file path=customXml/itemProps2.xml><?xml version="1.0" encoding="utf-8"?>
-<ds:datastoreItem xmlns:ds="http://schemas.openxmlformats.org/officeDocument/2006/customXml" ds:itemID="{DA63FD6A-B099-43EC-8BDB-E8CCA6240E18}">
-  <ds:schemaRefs>
-    <ds:schemaRef ds:uri="http://schemas.microsoft.com/sharepoint/v3/contenttype/forms"/>
   </ds:schemaRefs>
 </ds:datastoreItem>
 </file>
@@ -14095,9 +14205,9 @@
 </file>
 
 <file path=customXml/itemProps5.xml><?xml version="1.0" encoding="utf-8"?>
-<ds:datastoreItem xmlns:ds="http://schemas.openxmlformats.org/officeDocument/2006/customXml" ds:itemID="{664C9CA2-DAAF-46E5-825C-EB5C7B5D07C9}">
+<ds:datastoreItem xmlns:ds="http://schemas.openxmlformats.org/officeDocument/2006/customXml" ds:itemID="{DA63FD6A-B099-43EC-8BDB-E8CCA6240E18}">
   <ds:schemaRefs>
-    <ds:schemaRef ds:uri="http://schemas.openxmlformats.org/officeDocument/2006/bibliography"/>
+    <ds:schemaRef ds:uri="http://schemas.microsoft.com/sharepoint/v3/contenttype/forms"/>
   </ds:schemaRefs>
 </ds:datastoreItem>
 </file>
</xml_diff>